<commit_message>
Remove all systems normal and fix docx output path
</commit_message>
<xml_diff>
--- a/Generated_Posters/WhatsApp_Promos.docx
+++ b/Generated_Posters/WhatsApp_Promos.docx
@@ -34,7 +34,17 @@
     </w:p>
     <w:p>
       <w:r>
-        <w:t xml:space="preserve">Secure your spot for the AI Innovation Contest powered by AWS, Google Cloud, and IBM. The $50,000 prize pool is live, and winners will be awarded by Akon and Sonu Sood. Apply here:</w:t>
+        <w:t xml:space="preserve">🚀 𝗚𝗟𝗢𝗕𝗔𝗟 𝗧𝗔𝗟𝗘𝗡𝗧 𝗛𝗨𝗡𝗧 𝟮𝟬𝟮𝟲 is LIVE! 🚀</w:t>
+      </w:r>
+    </w:p>
+    <w:p>
+      <w:r>
+        <w:t xml:space="preserve">Secure your spot for the AI Innovation Contest powered by AWS, Google Cloud, and IBM. Compete for a massive 🏆 ₹𝟱𝟬 𝗟𝗔𝗞𝗛𝗦 prize pool and unlock 𝗔𝘀𝘀𝘂𝗿𝗲𝗱 𝗜𝗻𝘁𝗲𝗿𝗻𝘀𝗵𝗶𝗽𝘀 &amp; 𝗣𝗹𝗮𝗰𝗲𝗺𝗲𝗻𝘁 𝗦𝘂𝗽𝗽𝗼𝗿𝘁 for every participant! 💼✨</w:t>
+      </w:r>
+    </w:p>
+    <w:p>
+      <w:r>
+        <w:t xml:space="preserve">Don't miss out. Apply here:</w:t>
       </w:r>
     </w:p>
     <w:p>
@@ -56,7 +66,17 @@
     </w:p>
     <w:p>
       <w:r>
-        <w:t xml:space="preserve">The Career Accelerator Contest powered by AWS, Google Cloud, and IBM is officially open. Compete for the $50,000 prize pool and an award from Akon and Sonu Sood. Submit your application here:</w:t>
+        <w:t xml:space="preserve">🚀 𝗚𝗟𝗢𝗕𝗔𝗟 𝗧𝗔𝗟𝗘𝗡𝗧 𝗛𝗨𝗡𝗧 𝟮𝟬𝟮𝟲 is LIVE! 🚀</w:t>
+      </w:r>
+    </w:p>
+    <w:p>
+      <w:r>
+        <w:t xml:space="preserve">The Career Accelerator Contest powered by AWS, Google Cloud, and IBM is officially open. Compete for a massive 🏆 ₹𝟱𝟬 𝗟𝗔𝗞𝗛𝗦 prize pool and unlock 𝗔𝘀𝘀𝘂𝗿𝗲𝗱 𝗜𝗻𝘁𝗲𝗿𝗻𝘀𝗵𝗶𝗽𝘀 &amp; 𝗣𝗹𝗮𝗰𝗲𝗺𝗲𝗻𝘁 𝗦𝘂𝗽𝗽𝗼𝗿𝘁 for every participant! 💼✨</w:t>
+      </w:r>
+    </w:p>
+    <w:p>
+      <w:r>
+        <w:t xml:space="preserve">Submit your application here:</w:t>
       </w:r>
     </w:p>
     <w:p>
@@ -78,7 +98,17 @@
     </w:p>
     <w:p>
       <w:r>
-        <w:t xml:space="preserve">Registration is now open for the 3D Asset Design Contest powered by AWS, Google Cloud, and IBM. There is a $50,000 prize pool on the line, with awards presented by Akon and Sonu Sood. Register here:</w:t>
+        <w:t xml:space="preserve">🚀 𝗚𝗟𝗢𝗕𝗔𝗟 𝗧𝗔𝗟𝗘𝗡𝗧 𝗛𝗨𝗡𝗧 𝟮𝟬𝟮𝟲 is LIVE! 🚀</w:t>
+      </w:r>
+    </w:p>
+    <w:p>
+      <w:r>
+        <w:t xml:space="preserve">Registration is now open for the 3D Asset Design Contest powered by AWS, Google Cloud, and IBM. Compete for a massive 🏆 ₹𝟱𝟬 𝗟𝗔𝗞𝗛𝗦 prize pool and unlock 𝗔𝘀𝘀𝘂𝗿𝗲𝗱 𝗜𝗻𝘁𝗲𝗿𝗻𝘀𝗵𝗶𝗽𝘀 &amp; 𝗣𝗹𝗮𝗰𝗲𝗺𝗲𝗻𝘁 𝗦𝘂𝗽𝗽𝗼𝗿𝘁 for every participant! 💼✨</w:t>
+      </w:r>
+    </w:p>
+    <w:p>
+      <w:r>
+        <w:t xml:space="preserve">Register here:</w:t>
       </w:r>
     </w:p>
     <w:p>
@@ -100,7 +130,17 @@
     </w:p>
     <w:p>
       <w:r>
-        <w:t xml:space="preserve">Applications are live for the Digital Character Design Contest powered by AWS, Google Cloud, and IBM. The prize pool is $50,000, and winners will be awarded by Akon and Sonu Sood. Apply here:</w:t>
+        <w:t xml:space="preserve">🚀 𝗚𝗟𝗢𝗕𝗔𝗟 𝗧𝗔𝗟𝗘𝗡𝗧 𝗛𝗨𝗡𝗧 𝟮𝟬𝟮𝟲 is LIVE! 🚀</w:t>
+      </w:r>
+    </w:p>
+    <w:p>
+      <w:r>
+        <w:t xml:space="preserve">Applications are live for the Digital Character Design Contest powered by AWS, Google Cloud, and IBM. Compete for a massive 🏆 ₹𝟱𝟬 𝗟𝗔𝗞𝗛𝗦 prize pool and unlock 𝗔𝘀𝘀𝘂𝗿𝗲𝗱 𝗜𝗻𝘁𝗲𝗿𝗻𝘀𝗵𝗶𝗽𝘀 &amp; 𝗣𝗹𝗮𝗰𝗲𝗺𝗲𝗻𝘁 𝗦𝘂𝗽𝗽𝗼𝗿𝘁 for every participant! 💼✨</w:t>
+      </w:r>
+    </w:p>
+    <w:p>
+      <w:r>
+        <w:t xml:space="preserve">Apply here:</w:t>
       </w:r>
     </w:p>
     <w:p>
@@ -122,7 +162,17 @@
     </w:p>
     <w:p>
       <w:r>
-        <w:t xml:space="preserve">The Web Experience Design Contest powered by AWS, Google Cloud, and IBM is now accepting applications. Compete for a $50,000 prize pool, with winners awarded by Akon and Sonu Sood. Enter here:</w:t>
+        <w:t xml:space="preserve">🚀 𝗚𝗟𝗢𝗕𝗔𝗟 𝗧𝗔𝗟𝗘𝗡𝗧 𝗛𝗨𝗡𝗧 𝟮𝟬𝟮𝟲 is LIVE! 🚀</w:t>
+      </w:r>
+    </w:p>
+    <w:p>
+      <w:r>
+        <w:t xml:space="preserve">The Web Experience Design Contest powered by AWS, Google Cloud, and IBM is now accepting applications. Compete for a massive 🏆 ₹𝟱𝟬 𝗟𝗔𝗞𝗛𝗦 prize pool and unlock 𝗔𝘀𝘀𝘂𝗿𝗲𝗱 𝗜𝗻𝘁𝗲𝗿𝗻𝘀𝗵𝗶𝗽𝘀 &amp; 𝗣𝗹𝗮𝗰𝗲𝗺𝗲𝗻𝘁 𝗦𝘂𝗽𝗽𝗼𝗿𝘁 for every participant! 💼✨</w:t>
+      </w:r>
+    </w:p>
+    <w:p>
+      <w:r>
+        <w:t xml:space="preserve">Enter here:</w:t>
       </w:r>
     </w:p>
     <w:p>
@@ -144,7 +194,17 @@
     </w:p>
     <w:p>
       <w:r>
-        <w:t xml:space="preserve">Enter the AI Education Innovation Contest powered by AWS, Google Cloud, and IBM. There is a $50,000 prize pool, and winners are awarded by Akon and Sonu Sood. Secure your entry here:</w:t>
+        <w:t xml:space="preserve">🚀 𝗚𝗟𝗢𝗕𝗔𝗟 𝗧𝗔𝗟𝗘𝗡𝗧 𝗛𝗨𝗡𝗧 𝟮𝟬𝟮𝟲 is LIVE! 🚀</w:t>
+      </w:r>
+    </w:p>
+    <w:p>
+      <w:r>
+        <w:t xml:space="preserve">Enter the AI Education Innovation Contest powered by AWS, Google Cloud, and IBM. Compete for a massive 🏆 ₹𝟱𝟬 𝗟𝗔𝗞𝗛𝗦 prize pool and unlock 𝗔𝘀𝘀𝘂𝗿𝗲𝗱 𝗜𝗻𝘁𝗲𝗿𝗻𝘀𝗵𝗶𝗽𝘀 &amp; 𝗣𝗹𝗮𝗰𝗲𝗺𝗲𝗻𝘁 𝗦𝘂𝗽𝗽𝗼𝗿𝘁 for every participant! 💼✨</w:t>
+      </w:r>
+    </w:p>
+    <w:p>
+      <w:r>
+        <w:t xml:space="preserve">Secure your entry here:</w:t>
       </w:r>
     </w:p>
     <w:p>
@@ -175,7 +235,17 @@
     </w:p>
     <w:p>
       <w:r>
-        <w:t xml:space="preserve">Secure your spot for the AI Innovation Contest powered by AWS, Google Cloud, and IBM. The $50,000 prize pool is live, and winners will be awarded by Akon and Sonu Sood. Apply here:</w:t>
+        <w:t xml:space="preserve">🚀 𝗚𝗟𝗢𝗕𝗔𝗟 𝗧𝗔𝗟𝗘𝗡𝗧 𝗛𝗨𝗡𝗧 𝟮𝟬𝟮𝟲 is LIVE! 🚀</w:t>
+      </w:r>
+    </w:p>
+    <w:p>
+      <w:r>
+        <w:t xml:space="preserve">Secure your spot for the AI Innovation Contest powered by AWS, Google Cloud, and IBM. Compete for a massive 🏆 ₹𝟱𝟬 𝗟𝗔𝗞𝗛𝗦 prize pool and unlock 𝗔𝘀𝘀𝘂𝗿𝗲𝗱 𝗜𝗻𝘁𝗲𝗿𝗻𝘀𝗵𝗶𝗽𝘀 &amp; 𝗣𝗹𝗮𝗰𝗲𝗺𝗲𝗻𝘁 𝗦𝘂𝗽𝗽𝗼𝗿𝘁 for every participant! 💼✨</w:t>
+      </w:r>
+    </w:p>
+    <w:p>
+      <w:r>
+        <w:t xml:space="preserve">Don't miss out. Apply here:</w:t>
       </w:r>
     </w:p>
     <w:p>
@@ -197,7 +267,17 @@
     </w:p>
     <w:p>
       <w:r>
-        <w:t xml:space="preserve">The Career Accelerator Contest powered by AWS, Google Cloud, and IBM is officially open. Compete for the $50,000 prize pool and an award from Akon and Sonu Sood. Submit your application here:</w:t>
+        <w:t xml:space="preserve">🚀 𝗚𝗟𝗢𝗕𝗔𝗟 𝗧𝗔𝗟𝗘𝗡𝗧 𝗛𝗨𝗡𝗧 𝟮𝟬𝟮𝟲 is LIVE! 🚀</w:t>
+      </w:r>
+    </w:p>
+    <w:p>
+      <w:r>
+        <w:t xml:space="preserve">The Career Accelerator Contest powered by AWS, Google Cloud, and IBM is officially open. Compete for a massive 🏆 ₹𝟱𝟬 𝗟𝗔𝗞𝗛𝗦 prize pool and unlock 𝗔𝘀𝘀𝘂𝗿𝗲𝗱 𝗜𝗻𝘁𝗲𝗿𝗻𝘀𝗵𝗶𝗽𝘀 &amp; 𝗣𝗹𝗮𝗰𝗲𝗺𝗲𝗻𝘁 𝗦𝘂𝗽𝗽𝗼𝗿𝘁 for every participant! 💼✨</w:t>
+      </w:r>
+    </w:p>
+    <w:p>
+      <w:r>
+        <w:t xml:space="preserve">Submit your application here:</w:t>
       </w:r>
     </w:p>
     <w:p>
@@ -219,7 +299,17 @@
     </w:p>
     <w:p>
       <w:r>
-        <w:t xml:space="preserve">Registration is now open for the 3D Asset Design Contest powered by AWS, Google Cloud, and IBM. There is a $50,000 prize pool on the line, with awards presented by Akon and Sonu Sood. Register here:</w:t>
+        <w:t xml:space="preserve">🚀 𝗚𝗟𝗢𝗕𝗔𝗟 𝗧𝗔𝗟𝗘𝗡𝗧 𝗛𝗨𝗡𝗧 𝟮𝟬𝟮𝟲 is LIVE! 🚀</w:t>
+      </w:r>
+    </w:p>
+    <w:p>
+      <w:r>
+        <w:t xml:space="preserve">Registration is now open for the 3D Asset Design Contest powered by AWS, Google Cloud, and IBM. Compete for a massive 🏆 ₹𝟱𝟬 𝗟𝗔𝗞𝗛𝗦 prize pool and unlock 𝗔𝘀𝘀𝘂𝗿𝗲𝗱 𝗜𝗻𝘁𝗲𝗿𝗻𝘀𝗵𝗶𝗽𝘀 &amp; 𝗣𝗹𝗮𝗰𝗲𝗺𝗲𝗻𝘁 𝗦𝘂𝗽𝗽𝗼𝗿𝘁 for every participant! 💼✨</w:t>
+      </w:r>
+    </w:p>
+    <w:p>
+      <w:r>
+        <w:t xml:space="preserve">Register here:</w:t>
       </w:r>
     </w:p>
     <w:p>
@@ -241,7 +331,17 @@
     </w:p>
     <w:p>
       <w:r>
-        <w:t xml:space="preserve">Applications are live for the Digital Character Design Contest powered by AWS, Google Cloud, and IBM. The prize pool is $50,000, and winners will be awarded by Akon and Sonu Sood. Apply here:</w:t>
+        <w:t xml:space="preserve">🚀 𝗚𝗟𝗢𝗕𝗔𝗟 𝗧𝗔𝗟𝗘𝗡𝗧 𝗛𝗨𝗡𝗧 𝟮𝟬𝟮𝟲 is LIVE! 🚀</w:t>
+      </w:r>
+    </w:p>
+    <w:p>
+      <w:r>
+        <w:t xml:space="preserve">Applications are live for the Digital Character Design Contest powered by AWS, Google Cloud, and IBM. Compete for a massive 🏆 ₹𝟱𝟬 𝗟𝗔𝗞𝗛𝗦 prize pool and unlock 𝗔𝘀𝘀𝘂𝗿𝗲𝗱 𝗜𝗻𝘁𝗲𝗿𝗻𝘀𝗵𝗶𝗽𝘀 &amp; 𝗣𝗹𝗮𝗰𝗲𝗺𝗲𝗻𝘁 𝗦𝘂𝗽𝗽𝗼𝗿𝘁 for every participant! 💼✨</w:t>
+      </w:r>
+    </w:p>
+    <w:p>
+      <w:r>
+        <w:t xml:space="preserve">Apply here:</w:t>
       </w:r>
     </w:p>
     <w:p>
@@ -263,7 +363,17 @@
     </w:p>
     <w:p>
       <w:r>
-        <w:t xml:space="preserve">The Web Experience Design Contest powered by AWS, Google Cloud, and IBM is now accepting applications. Compete for a $50,000 prize pool, with winners awarded by Akon and Sonu Sood. Enter here:</w:t>
+        <w:t xml:space="preserve">🚀 𝗚𝗟𝗢𝗕𝗔𝗟 𝗧𝗔𝗟𝗘𝗡𝗧 𝗛𝗨𝗡𝗧 𝟮𝟬𝟮𝟲 is LIVE! 🚀</w:t>
+      </w:r>
+    </w:p>
+    <w:p>
+      <w:r>
+        <w:t xml:space="preserve">The Web Experience Design Contest powered by AWS, Google Cloud, and IBM is now accepting applications. Compete for a massive 🏆 ₹𝟱𝟬 𝗟𝗔𝗞𝗛𝗦 prize pool and unlock 𝗔𝘀𝘀𝘂𝗿𝗲𝗱 𝗜𝗻𝘁𝗲𝗿𝗻𝘀𝗵𝗶𝗽𝘀 &amp; 𝗣𝗹𝗮𝗰𝗲𝗺𝗲𝗻𝘁 𝗦𝘂𝗽𝗽𝗼𝗿𝘁 for every participant! 💼✨</w:t>
+      </w:r>
+    </w:p>
+    <w:p>
+      <w:r>
+        <w:t xml:space="preserve">Enter here:</w:t>
       </w:r>
     </w:p>
     <w:p>
@@ -285,7 +395,17 @@
     </w:p>
     <w:p>
       <w:r>
-        <w:t xml:space="preserve">Enter the AI Education Innovation Contest powered by AWS, Google Cloud, and IBM. There is a $50,000 prize pool, and winners are awarded by Akon and Sonu Sood. Secure your entry here:</w:t>
+        <w:t xml:space="preserve">🚀 𝗚𝗟𝗢𝗕𝗔𝗟 𝗧𝗔𝗟𝗘𝗡𝗧 𝗛𝗨𝗡𝗧 𝟮𝟬𝟮𝟲 is LIVE! 🚀</w:t>
+      </w:r>
+    </w:p>
+    <w:p>
+      <w:r>
+        <w:t xml:space="preserve">Enter the AI Education Innovation Contest powered by AWS, Google Cloud, and IBM. Compete for a massive 🏆 ₹𝟱𝟬 𝗟𝗔𝗞𝗛𝗦 prize pool and unlock 𝗔𝘀𝘀𝘂𝗿𝗲𝗱 𝗜𝗻𝘁𝗲𝗿𝗻𝘀𝗵𝗶𝗽𝘀 &amp; 𝗣𝗹𝗮𝗰𝗲𝗺𝗲𝗻𝘁 𝗦𝘂𝗽𝗽𝗼𝗿𝘁 for every participant! 💼✨</w:t>
+      </w:r>
+    </w:p>
+    <w:p>
+      <w:r>
+        <w:t xml:space="preserve">Secure your entry here:</w:t>
       </w:r>
     </w:p>
     <w:p>
@@ -316,7 +436,17 @@
     </w:p>
     <w:p>
       <w:r>
-        <w:t xml:space="preserve">Secure your spot for the AI Innovation Contest powered by AWS, Google Cloud, and IBM. The $50,000 prize pool is live, and winners will be awarded by Akon and Sonu Sood. Apply here:</w:t>
+        <w:t xml:space="preserve">🚀 𝗚𝗟𝗢𝗕𝗔𝗟 𝗧𝗔𝗟𝗘𝗡𝗧 𝗛𝗨𝗡𝗧 𝟮𝟬𝟮𝟲 is LIVE! 🚀</w:t>
+      </w:r>
+    </w:p>
+    <w:p>
+      <w:r>
+        <w:t xml:space="preserve">Secure your spot for the AI Innovation Contest powered by AWS, Google Cloud, and IBM. Compete for a massive 🏆 ₹𝟱𝟬 𝗟𝗔𝗞𝗛𝗦 prize pool and unlock 𝗔𝘀𝘀𝘂𝗿𝗲𝗱 𝗜𝗻𝘁𝗲𝗿𝗻𝘀𝗵𝗶𝗽𝘀 &amp; 𝗣𝗹𝗮𝗰𝗲𝗺𝗲𝗻𝘁 𝗦𝘂𝗽𝗽𝗼𝗿𝘁 for every participant! 💼✨</w:t>
+      </w:r>
+    </w:p>
+    <w:p>
+      <w:r>
+        <w:t xml:space="preserve">Don't miss out. Apply here:</w:t>
       </w:r>
     </w:p>
     <w:p>
@@ -338,7 +468,17 @@
     </w:p>
     <w:p>
       <w:r>
-        <w:t xml:space="preserve">The Career Accelerator Contest powered by AWS, Google Cloud, and IBM is officially open. Compete for the $50,000 prize pool and an award from Akon and Sonu Sood. Submit your application here:</w:t>
+        <w:t xml:space="preserve">🚀 𝗚𝗟𝗢𝗕𝗔𝗟 𝗧𝗔𝗟𝗘𝗡𝗧 𝗛𝗨𝗡𝗧 𝟮𝟬𝟮𝟲 is LIVE! 🚀</w:t>
+      </w:r>
+    </w:p>
+    <w:p>
+      <w:r>
+        <w:t xml:space="preserve">The Career Accelerator Contest powered by AWS, Google Cloud, and IBM is officially open. Compete for a massive 🏆 ₹𝟱𝟬 𝗟𝗔𝗞𝗛𝗦 prize pool and unlock 𝗔𝘀𝘀𝘂𝗿𝗲𝗱 𝗜𝗻𝘁𝗲𝗿𝗻𝘀𝗵𝗶𝗽𝘀 &amp; 𝗣𝗹𝗮𝗰𝗲𝗺𝗲𝗻𝘁 𝗦𝘂𝗽𝗽𝗼𝗿𝘁 for every participant! 💼✨</w:t>
+      </w:r>
+    </w:p>
+    <w:p>
+      <w:r>
+        <w:t xml:space="preserve">Submit your application here:</w:t>
       </w:r>
     </w:p>
     <w:p>
@@ -360,7 +500,17 @@
     </w:p>
     <w:p>
       <w:r>
-        <w:t xml:space="preserve">Registration is now open for the 3D Asset Design Contest powered by AWS, Google Cloud, and IBM. There is a $50,000 prize pool on the line, with awards presented by Akon and Sonu Sood. Register here:</w:t>
+        <w:t xml:space="preserve">🚀 𝗚𝗟𝗢𝗕𝗔𝗟 𝗧𝗔𝗟𝗘𝗡𝗧 𝗛𝗨𝗡𝗧 𝟮𝟬𝟮𝟲 is LIVE! 🚀</w:t>
+      </w:r>
+    </w:p>
+    <w:p>
+      <w:r>
+        <w:t xml:space="preserve">Registration is now open for the 3D Asset Design Contest powered by AWS, Google Cloud, and IBM. Compete for a massive 🏆 ₹𝟱𝟬 𝗟𝗔𝗞𝗛𝗦 prize pool and unlock 𝗔𝘀𝘀𝘂𝗿𝗲𝗱 𝗜𝗻𝘁𝗲𝗿𝗻𝘀𝗵𝗶𝗽𝘀 &amp; 𝗣𝗹𝗮𝗰𝗲𝗺𝗲𝗻𝘁 𝗦𝘂𝗽𝗽𝗼𝗿𝘁 for every participant! 💼✨</w:t>
+      </w:r>
+    </w:p>
+    <w:p>
+      <w:r>
+        <w:t xml:space="preserve">Register here:</w:t>
       </w:r>
     </w:p>
     <w:p>
@@ -382,7 +532,17 @@
     </w:p>
     <w:p>
       <w:r>
-        <w:t xml:space="preserve">Applications are live for the Digital Character Design Contest powered by AWS, Google Cloud, and IBM. The prize pool is $50,000, and winners will be awarded by Akon and Sonu Sood. Apply here:</w:t>
+        <w:t xml:space="preserve">🚀 𝗚𝗟𝗢𝗕𝗔𝗟 𝗧𝗔𝗟𝗘𝗡𝗧 𝗛𝗨𝗡𝗧 𝟮𝟬𝟮𝟲 is LIVE! 🚀</w:t>
+      </w:r>
+    </w:p>
+    <w:p>
+      <w:r>
+        <w:t xml:space="preserve">Applications are live for the Digital Character Design Contest powered by AWS, Google Cloud, and IBM. Compete for a massive 🏆 ₹𝟱𝟬 𝗟𝗔𝗞𝗛𝗦 prize pool and unlock 𝗔𝘀𝘀𝘂𝗿𝗲𝗱 𝗜𝗻𝘁𝗲𝗿𝗻𝘀𝗵𝗶𝗽𝘀 &amp; 𝗣𝗹𝗮𝗰𝗲𝗺𝗲𝗻𝘁 𝗦𝘂𝗽𝗽𝗼𝗿𝘁 for every participant! 💼✨</w:t>
+      </w:r>
+    </w:p>
+    <w:p>
+      <w:r>
+        <w:t xml:space="preserve">Apply here:</w:t>
       </w:r>
     </w:p>
     <w:p>
@@ -404,7 +564,17 @@
     </w:p>
     <w:p>
       <w:r>
-        <w:t xml:space="preserve">The Web Experience Design Contest powered by AWS, Google Cloud, and IBM is now accepting applications. Compete for a $50,000 prize pool, with winners awarded by Akon and Sonu Sood. Enter here:</w:t>
+        <w:t xml:space="preserve">🚀 𝗚𝗟𝗢𝗕𝗔𝗟 𝗧𝗔𝗟𝗘𝗡𝗧 𝗛𝗨𝗡𝗧 𝟮𝟬𝟮𝟲 is LIVE! 🚀</w:t>
+      </w:r>
+    </w:p>
+    <w:p>
+      <w:r>
+        <w:t xml:space="preserve">The Web Experience Design Contest powered by AWS, Google Cloud, and IBM is now accepting applications. Compete for a massive 🏆 ₹𝟱𝟬 𝗟𝗔𝗞𝗛𝗦 prize pool and unlock 𝗔𝘀𝘀𝘂𝗿𝗲𝗱 𝗜𝗻𝘁𝗲𝗿𝗻𝘀𝗵𝗶𝗽𝘀 &amp; 𝗣𝗹𝗮𝗰𝗲𝗺𝗲𝗻𝘁 𝗦𝘂𝗽𝗽𝗼𝗿𝘁 for every participant! 💼✨</w:t>
+      </w:r>
+    </w:p>
+    <w:p>
+      <w:r>
+        <w:t xml:space="preserve">Enter here:</w:t>
       </w:r>
     </w:p>
     <w:p>
@@ -426,7 +596,17 @@
     </w:p>
     <w:p>
       <w:r>
-        <w:t xml:space="preserve">Enter the AI Education Innovation Contest powered by AWS, Google Cloud, and IBM. There is a $50,000 prize pool, and winners are awarded by Akon and Sonu Sood. Secure your entry here:</w:t>
+        <w:t xml:space="preserve">🚀 𝗚𝗟𝗢𝗕𝗔𝗟 𝗧𝗔𝗟𝗘𝗡𝗧 𝗛𝗨𝗡𝗧 𝟮𝟬𝟮𝟲 is LIVE! 🚀</w:t>
+      </w:r>
+    </w:p>
+    <w:p>
+      <w:r>
+        <w:t xml:space="preserve">Enter the AI Education Innovation Contest powered by AWS, Google Cloud, and IBM. Compete for a massive 🏆 ₹𝟱𝟬 𝗟𝗔𝗞𝗛𝗦 prize pool and unlock 𝗔𝘀𝘀𝘂𝗿𝗲𝗱 𝗜𝗻𝘁𝗲𝗿𝗻𝘀𝗵𝗶𝗽𝘀 &amp; 𝗣𝗹𝗮𝗰𝗲𝗺𝗲𝗻𝘁 𝗦𝘂𝗽𝗽𝗼𝗿𝘁 for every participant! 💼✨</w:t>
+      </w:r>
+    </w:p>
+    <w:p>
+      <w:r>
+        <w:t xml:space="preserve">Secure your entry here:</w:t>
       </w:r>
     </w:p>
     <w:p>
@@ -457,7 +637,17 @@
     </w:p>
     <w:p>
       <w:r>
-        <w:t xml:space="preserve">Secure your spot for the AI Innovation Contest powered by AWS, Google Cloud, and IBM. The $50,000 prize pool is live, and winners will be awarded by Akon and Sonu Sood. Apply here:</w:t>
+        <w:t xml:space="preserve">🚀 𝗚𝗟𝗢𝗕𝗔𝗟 𝗧𝗔𝗟𝗘𝗡𝗧 𝗛𝗨𝗡𝗧 𝟮𝟬𝟮𝟲 is LIVE! 🚀</w:t>
+      </w:r>
+    </w:p>
+    <w:p>
+      <w:r>
+        <w:t xml:space="preserve">Secure your spot for the AI Innovation Contest powered by AWS, Google Cloud, and IBM. Compete for a massive 🏆 ₹𝟱𝟬 𝗟𝗔𝗞𝗛𝗦 prize pool and unlock 𝗔𝘀𝘀𝘂𝗿𝗲𝗱 𝗜𝗻𝘁𝗲𝗿𝗻𝘀𝗵𝗶𝗽𝘀 &amp; 𝗣𝗹𝗮𝗰𝗲𝗺𝗲𝗻𝘁 𝗦𝘂𝗽𝗽𝗼𝗿𝘁 for every participant! 💼✨</w:t>
+      </w:r>
+    </w:p>
+    <w:p>
+      <w:r>
+        <w:t xml:space="preserve">Don't miss out. Apply here:</w:t>
       </w:r>
     </w:p>
     <w:p>
@@ -479,7 +669,17 @@
     </w:p>
     <w:p>
       <w:r>
-        <w:t xml:space="preserve">The Career Accelerator Contest powered by AWS, Google Cloud, and IBM is officially open. Compete for the $50,000 prize pool and an award from Akon and Sonu Sood. Submit your application here:</w:t>
+        <w:t xml:space="preserve">🚀 𝗚𝗟𝗢𝗕𝗔𝗟 𝗧𝗔𝗟𝗘𝗡𝗧 𝗛𝗨𝗡𝗧 𝟮𝟬𝟮𝟲 is LIVE! 🚀</w:t>
+      </w:r>
+    </w:p>
+    <w:p>
+      <w:r>
+        <w:t xml:space="preserve">The Career Accelerator Contest powered by AWS, Google Cloud, and IBM is officially open. Compete for a massive 🏆 ₹𝟱𝟬 𝗟𝗔𝗞𝗛𝗦 prize pool and unlock 𝗔𝘀𝘀𝘂𝗿𝗲𝗱 𝗜𝗻𝘁𝗲𝗿𝗻𝘀𝗵𝗶𝗽𝘀 &amp; 𝗣𝗹𝗮𝗰𝗲𝗺𝗲𝗻𝘁 𝗦𝘂𝗽𝗽𝗼𝗿𝘁 for every participant! 💼✨</w:t>
+      </w:r>
+    </w:p>
+    <w:p>
+      <w:r>
+        <w:t xml:space="preserve">Submit your application here:</w:t>
       </w:r>
     </w:p>
     <w:p>
@@ -501,7 +701,17 @@
     </w:p>
     <w:p>
       <w:r>
-        <w:t xml:space="preserve">Registration is now open for the 3D Asset Design Contest powered by AWS, Google Cloud, and IBM. There is a $50,000 prize pool on the line, with awards presented by Akon and Sonu Sood. Register here:</w:t>
+        <w:t xml:space="preserve">🚀 𝗚𝗟𝗢𝗕𝗔𝗟 𝗧𝗔𝗟𝗘𝗡𝗧 𝗛𝗨𝗡𝗧 𝟮𝟬𝟮𝟲 is LIVE! 🚀</w:t>
+      </w:r>
+    </w:p>
+    <w:p>
+      <w:r>
+        <w:t xml:space="preserve">Registration is now open for the 3D Asset Design Contest powered by AWS, Google Cloud, and IBM. Compete for a massive 🏆 ₹𝟱𝟬 𝗟𝗔𝗞𝗛𝗦 prize pool and unlock 𝗔𝘀𝘀𝘂𝗿𝗲𝗱 𝗜𝗻𝘁𝗲𝗿𝗻𝘀𝗵𝗶𝗽𝘀 &amp; 𝗣𝗹𝗮𝗰𝗲𝗺𝗲𝗻𝘁 𝗦𝘂𝗽𝗽𝗼𝗿𝘁 for every participant! 💼✨</w:t>
+      </w:r>
+    </w:p>
+    <w:p>
+      <w:r>
+        <w:t xml:space="preserve">Register here:</w:t>
       </w:r>
     </w:p>
     <w:p>
@@ -523,7 +733,17 @@
     </w:p>
     <w:p>
       <w:r>
-        <w:t xml:space="preserve">Applications are live for the Digital Character Design Contest powered by AWS, Google Cloud, and IBM. The prize pool is $50,000, and winners will be awarded by Akon and Sonu Sood. Apply here:</w:t>
+        <w:t xml:space="preserve">🚀 𝗚𝗟𝗢𝗕𝗔𝗟 𝗧𝗔𝗟𝗘𝗡𝗧 𝗛𝗨𝗡𝗧 𝟮𝟬𝟮𝟲 is LIVE! 🚀</w:t>
+      </w:r>
+    </w:p>
+    <w:p>
+      <w:r>
+        <w:t xml:space="preserve">Applications are live for the Digital Character Design Contest powered by AWS, Google Cloud, and IBM. Compete for a massive 🏆 ₹𝟱𝟬 𝗟𝗔𝗞𝗛𝗦 prize pool and unlock 𝗔𝘀𝘀𝘂𝗿𝗲𝗱 𝗜𝗻𝘁𝗲𝗿𝗻𝘀𝗵𝗶𝗽𝘀 &amp; 𝗣𝗹𝗮𝗰𝗲𝗺𝗲𝗻𝘁 𝗦𝘂𝗽𝗽𝗼𝗿𝘁 for every participant! 💼✨</w:t>
+      </w:r>
+    </w:p>
+    <w:p>
+      <w:r>
+        <w:t xml:space="preserve">Apply here:</w:t>
       </w:r>
     </w:p>
     <w:p>
@@ -545,7 +765,17 @@
     </w:p>
     <w:p>
       <w:r>
-        <w:t xml:space="preserve">The Web Experience Design Contest powered by AWS, Google Cloud, and IBM is now accepting applications. Compete for a $50,000 prize pool, with winners awarded by Akon and Sonu Sood. Enter here:</w:t>
+        <w:t xml:space="preserve">🚀 𝗚𝗟𝗢𝗕𝗔𝗟 𝗧𝗔𝗟𝗘𝗡𝗧 𝗛𝗨𝗡𝗧 𝟮𝟬𝟮𝟲 is LIVE! 🚀</w:t>
+      </w:r>
+    </w:p>
+    <w:p>
+      <w:r>
+        <w:t xml:space="preserve">The Web Experience Design Contest powered by AWS, Google Cloud, and IBM is now accepting applications. Compete for a massive 🏆 ₹𝟱𝟬 𝗟𝗔𝗞𝗛𝗦 prize pool and unlock 𝗔𝘀𝘀𝘂𝗿𝗲𝗱 𝗜𝗻𝘁𝗲𝗿𝗻𝘀𝗵𝗶𝗽𝘀 &amp; 𝗣𝗹𝗮𝗰𝗲𝗺𝗲𝗻𝘁 𝗦𝘂𝗽𝗽𝗼𝗿𝘁 for every participant! 💼✨</w:t>
+      </w:r>
+    </w:p>
+    <w:p>
+      <w:r>
+        <w:t xml:space="preserve">Enter here:</w:t>
       </w:r>
     </w:p>
     <w:p>
@@ -567,7 +797,17 @@
     </w:p>
     <w:p>
       <w:r>
-        <w:t xml:space="preserve">Enter the AI Education Innovation Contest powered by AWS, Google Cloud, and IBM. There is a $50,000 prize pool, and winners are awarded by Akon and Sonu Sood. Secure your entry here:</w:t>
+        <w:t xml:space="preserve">🚀 𝗚𝗟𝗢𝗕𝗔𝗟 𝗧𝗔𝗟𝗘𝗡𝗧 𝗛𝗨𝗡𝗧 𝟮𝟬𝟮𝟲 is LIVE! 🚀</w:t>
+      </w:r>
+    </w:p>
+    <w:p>
+      <w:r>
+        <w:t xml:space="preserve">Enter the AI Education Innovation Contest powered by AWS, Google Cloud, and IBM. Compete for a massive 🏆 ₹𝟱𝟬 𝗟𝗔𝗞𝗛𝗦 prize pool and unlock 𝗔𝘀𝘀𝘂𝗿𝗲𝗱 𝗜𝗻𝘁𝗲𝗿𝗻𝘀𝗵𝗶𝗽𝘀 &amp; 𝗣𝗹𝗮𝗰𝗲𝗺𝗲𝗻𝘁 𝗦𝘂𝗽𝗽𝗼𝗿𝘁 for every participant! 💼✨</w:t>
+      </w:r>
+    </w:p>
+    <w:p>
+      <w:r>
+        <w:t xml:space="preserve">Secure your entry here:</w:t>
       </w:r>
     </w:p>
     <w:p>
@@ -598,7 +838,17 @@
     </w:p>
     <w:p>
       <w:r>
-        <w:t xml:space="preserve">Secure your spot for the AI Innovation Contest powered by AWS, Google Cloud, and IBM. The $50,000 prize pool is live, and winners will be awarded by Akon and Sonu Sood. Apply here:</w:t>
+        <w:t xml:space="preserve">🚀 𝗚𝗟𝗢𝗕𝗔𝗟 𝗧𝗔𝗟𝗘𝗡𝗧 𝗛𝗨𝗡𝗧 𝟮𝟬𝟮𝟲 is LIVE! 🚀</w:t>
+      </w:r>
+    </w:p>
+    <w:p>
+      <w:r>
+        <w:t xml:space="preserve">Secure your spot for the AI Innovation Contest powered by AWS, Google Cloud, and IBM. Compete for a massive 🏆 ₹𝟱𝟬 𝗟𝗔𝗞𝗛𝗦 prize pool and unlock 𝗔𝘀𝘀𝘂𝗿𝗲𝗱 𝗜𝗻𝘁𝗲𝗿𝗻𝘀𝗵𝗶𝗽𝘀 &amp; 𝗣𝗹𝗮𝗰𝗲𝗺𝗲𝗻𝘁 𝗦𝘂𝗽𝗽𝗼𝗿𝘁 for every participant! 💼✨</w:t>
+      </w:r>
+    </w:p>
+    <w:p>
+      <w:r>
+        <w:t xml:space="preserve">Don't miss out. Apply here:</w:t>
       </w:r>
     </w:p>
     <w:p>
@@ -620,7 +870,17 @@
     </w:p>
     <w:p>
       <w:r>
-        <w:t xml:space="preserve">The Career Accelerator Contest powered by AWS, Google Cloud, and IBM is officially open. Compete for the $50,000 prize pool and an award from Akon and Sonu Sood. Submit your application here:</w:t>
+        <w:t xml:space="preserve">🚀 𝗚𝗟𝗢𝗕𝗔𝗟 𝗧𝗔𝗟𝗘𝗡𝗧 𝗛𝗨𝗡𝗧 𝟮𝟬𝟮𝟲 is LIVE! 🚀</w:t>
+      </w:r>
+    </w:p>
+    <w:p>
+      <w:r>
+        <w:t xml:space="preserve">The Career Accelerator Contest powered by AWS, Google Cloud, and IBM is officially open. Compete for a massive 🏆 ₹𝟱𝟬 𝗟𝗔𝗞𝗛𝗦 prize pool and unlock 𝗔𝘀𝘀𝘂𝗿𝗲𝗱 𝗜𝗻𝘁𝗲𝗿𝗻𝘀𝗵𝗶𝗽𝘀 &amp; 𝗣𝗹𝗮𝗰𝗲𝗺𝗲𝗻𝘁 𝗦𝘂𝗽𝗽𝗼𝗿𝘁 for every participant! 💼✨</w:t>
+      </w:r>
+    </w:p>
+    <w:p>
+      <w:r>
+        <w:t xml:space="preserve">Submit your application here:</w:t>
       </w:r>
     </w:p>
     <w:p>
@@ -642,7 +902,17 @@
     </w:p>
     <w:p>
       <w:r>
-        <w:t xml:space="preserve">Registration is now open for the 3D Asset Design Contest powered by AWS, Google Cloud, and IBM. There is a $50,000 prize pool on the line, with awards presented by Akon and Sonu Sood. Register here:</w:t>
+        <w:t xml:space="preserve">🚀 𝗚𝗟𝗢𝗕𝗔𝗟 𝗧𝗔𝗟𝗘𝗡𝗧 𝗛𝗨𝗡𝗧 𝟮𝟬𝟮𝟲 is LIVE! 🚀</w:t>
+      </w:r>
+    </w:p>
+    <w:p>
+      <w:r>
+        <w:t xml:space="preserve">Registration is now open for the 3D Asset Design Contest powered by AWS, Google Cloud, and IBM. Compete for a massive 🏆 ₹𝟱𝟬 𝗟𝗔𝗞𝗛𝗦 prize pool and unlock 𝗔𝘀𝘀𝘂𝗿𝗲𝗱 𝗜𝗻𝘁𝗲𝗿𝗻𝘀𝗵𝗶𝗽𝘀 &amp; 𝗣𝗹𝗮𝗰𝗲𝗺𝗲𝗻𝘁 𝗦𝘂𝗽𝗽𝗼𝗿𝘁 for every participant! 💼✨</w:t>
+      </w:r>
+    </w:p>
+    <w:p>
+      <w:r>
+        <w:t xml:space="preserve">Register here:</w:t>
       </w:r>
     </w:p>
     <w:p>
@@ -664,7 +934,17 @@
     </w:p>
     <w:p>
       <w:r>
-        <w:t xml:space="preserve">Applications are live for the Digital Character Design Contest powered by AWS, Google Cloud, and IBM. The prize pool is $50,000, and winners will be awarded by Akon and Sonu Sood. Apply here:</w:t>
+        <w:t xml:space="preserve">🚀 𝗚𝗟𝗢𝗕𝗔𝗟 𝗧𝗔𝗟𝗘𝗡𝗧 𝗛𝗨𝗡𝗧 𝟮𝟬𝟮𝟲 is LIVE! 🚀</w:t>
+      </w:r>
+    </w:p>
+    <w:p>
+      <w:r>
+        <w:t xml:space="preserve">Applications are live for the Digital Character Design Contest powered by AWS, Google Cloud, and IBM. Compete for a massive 🏆 ₹𝟱𝟬 𝗟𝗔𝗞𝗛𝗦 prize pool and unlock 𝗔𝘀𝘀𝘂𝗿𝗲𝗱 𝗜𝗻𝘁𝗲𝗿𝗻𝘀𝗵𝗶𝗽𝘀 &amp; 𝗣𝗹𝗮𝗰𝗲𝗺𝗲𝗻𝘁 𝗦𝘂𝗽𝗽𝗼𝗿𝘁 for every participant! 💼✨</w:t>
+      </w:r>
+    </w:p>
+    <w:p>
+      <w:r>
+        <w:t xml:space="preserve">Apply here:</w:t>
       </w:r>
     </w:p>
     <w:p>
@@ -686,7 +966,17 @@
     </w:p>
     <w:p>
       <w:r>
-        <w:t xml:space="preserve">The Web Experience Design Contest powered by AWS, Google Cloud, and IBM is now accepting applications. Compete for a $50,000 prize pool, with winners awarded by Akon and Sonu Sood. Enter here:</w:t>
+        <w:t xml:space="preserve">🚀 𝗚𝗟𝗢𝗕𝗔𝗟 𝗧𝗔𝗟𝗘𝗡𝗧 𝗛𝗨𝗡𝗧 𝟮𝟬𝟮𝟲 is LIVE! 🚀</w:t>
+      </w:r>
+    </w:p>
+    <w:p>
+      <w:r>
+        <w:t xml:space="preserve">The Web Experience Design Contest powered by AWS, Google Cloud, and IBM is now accepting applications. Compete for a massive 🏆 ₹𝟱𝟬 𝗟𝗔𝗞𝗛𝗦 prize pool and unlock 𝗔𝘀𝘀𝘂𝗿𝗲𝗱 𝗜𝗻𝘁𝗲𝗿𝗻𝘀𝗵𝗶𝗽𝘀 &amp; 𝗣𝗹𝗮𝗰𝗲𝗺𝗲𝗻𝘁 𝗦𝘂𝗽𝗽𝗼𝗿𝘁 for every participant! 💼✨</w:t>
+      </w:r>
+    </w:p>
+    <w:p>
+      <w:r>
+        <w:t xml:space="preserve">Enter here:</w:t>
       </w:r>
     </w:p>
     <w:p>
@@ -708,7 +998,17 @@
     </w:p>
     <w:p>
       <w:r>
-        <w:t xml:space="preserve">Enter the AI Education Innovation Contest powered by AWS, Google Cloud, and IBM. There is a $50,000 prize pool, and winners are awarded by Akon and Sonu Sood. Secure your entry here:</w:t>
+        <w:t xml:space="preserve">🚀 𝗚𝗟𝗢𝗕𝗔𝗟 𝗧𝗔𝗟𝗘𝗡𝗧 𝗛𝗨𝗡𝗧 𝟮𝟬𝟮𝟲 is LIVE! 🚀</w:t>
+      </w:r>
+    </w:p>
+    <w:p>
+      <w:r>
+        <w:t xml:space="preserve">Enter the AI Education Innovation Contest powered by AWS, Google Cloud, and IBM. Compete for a massive 🏆 ₹𝟱𝟬 𝗟𝗔𝗞𝗛𝗦 prize pool and unlock 𝗔𝘀𝘀𝘂𝗿𝗲𝗱 𝗜𝗻𝘁𝗲𝗿𝗻𝘀𝗵𝗶𝗽𝘀 &amp; 𝗣𝗹𝗮𝗰𝗲𝗺𝗲𝗻𝘁 𝗦𝘂𝗽𝗽𝗼𝗿𝘁 for every participant! 💼✨</w:t>
+      </w:r>
+    </w:p>
+    <w:p>
+      <w:r>
+        <w:t xml:space="preserve">Secure your entry here:</w:t>
       </w:r>
     </w:p>
     <w:p>
@@ -739,7 +1039,17 @@
     </w:p>
     <w:p>
       <w:r>
-        <w:t xml:space="preserve">Secure your spot for the AI Innovation Contest powered by AWS, Google Cloud, and IBM. The $50,000 prize pool is live, and winners will be awarded by Akon and Sonu Sood. Apply here:</w:t>
+        <w:t xml:space="preserve">🚀 𝗚𝗟𝗢𝗕𝗔𝗟 𝗧𝗔𝗟𝗘𝗡𝗧 𝗛𝗨𝗡𝗧 𝟮𝟬𝟮𝟲 is LIVE! 🚀</w:t>
+      </w:r>
+    </w:p>
+    <w:p>
+      <w:r>
+        <w:t xml:space="preserve">Secure your spot for the AI Innovation Contest powered by AWS, Google Cloud, and IBM. Compete for a massive 🏆 ₹𝟱𝟬 𝗟𝗔𝗞𝗛𝗦 prize pool and unlock 𝗔𝘀𝘀𝘂𝗿𝗲𝗱 𝗜𝗻𝘁𝗲𝗿𝗻𝘀𝗵𝗶𝗽𝘀 &amp; 𝗣𝗹𝗮𝗰𝗲𝗺𝗲𝗻𝘁 𝗦𝘂𝗽𝗽𝗼𝗿𝘁 for every participant! 💼✨</w:t>
+      </w:r>
+    </w:p>
+    <w:p>
+      <w:r>
+        <w:t xml:space="preserve">Don't miss out. Apply here:</w:t>
       </w:r>
     </w:p>
     <w:p>
@@ -761,7 +1071,17 @@
     </w:p>
     <w:p>
       <w:r>
-        <w:t xml:space="preserve">The Career Accelerator Contest powered by AWS, Google Cloud, and IBM is officially open. Compete for the $50,000 prize pool and an award from Akon and Sonu Sood. Submit your application here:</w:t>
+        <w:t xml:space="preserve">🚀 𝗚𝗟𝗢𝗕𝗔𝗟 𝗧𝗔𝗟𝗘𝗡𝗧 𝗛𝗨𝗡𝗧 𝟮𝟬𝟮𝟲 is LIVE! 🚀</w:t>
+      </w:r>
+    </w:p>
+    <w:p>
+      <w:r>
+        <w:t xml:space="preserve">The Career Accelerator Contest powered by AWS, Google Cloud, and IBM is officially open. Compete for a massive 🏆 ₹𝟱𝟬 𝗟𝗔𝗞𝗛𝗦 prize pool and unlock 𝗔𝘀𝘀𝘂𝗿𝗲𝗱 𝗜𝗻𝘁𝗲𝗿𝗻𝘀𝗵𝗶𝗽𝘀 &amp; 𝗣𝗹𝗮𝗰𝗲𝗺𝗲𝗻𝘁 𝗦𝘂𝗽𝗽𝗼𝗿𝘁 for every participant! 💼✨</w:t>
+      </w:r>
+    </w:p>
+    <w:p>
+      <w:r>
+        <w:t xml:space="preserve">Submit your application here:</w:t>
       </w:r>
     </w:p>
     <w:p>
@@ -783,7 +1103,17 @@
     </w:p>
     <w:p>
       <w:r>
-        <w:t xml:space="preserve">Registration is now open for the 3D Asset Design Contest powered by AWS, Google Cloud, and IBM. There is a $50,000 prize pool on the line, with awards presented by Akon and Sonu Sood. Register here:</w:t>
+        <w:t xml:space="preserve">🚀 𝗚𝗟𝗢𝗕𝗔𝗟 𝗧𝗔𝗟𝗘𝗡𝗧 𝗛𝗨𝗡𝗧 𝟮𝟬𝟮𝟲 is LIVE! 🚀</w:t>
+      </w:r>
+    </w:p>
+    <w:p>
+      <w:r>
+        <w:t xml:space="preserve">Registration is now open for the 3D Asset Design Contest powered by AWS, Google Cloud, and IBM. Compete for a massive 🏆 ₹𝟱𝟬 𝗟𝗔𝗞𝗛𝗦 prize pool and unlock 𝗔𝘀𝘀𝘂𝗿𝗲𝗱 𝗜𝗻𝘁𝗲𝗿𝗻𝘀𝗵𝗶𝗽𝘀 &amp; 𝗣𝗹𝗮𝗰𝗲𝗺𝗲𝗻𝘁 𝗦𝘂𝗽𝗽𝗼𝗿𝘁 for every participant! 💼✨</w:t>
+      </w:r>
+    </w:p>
+    <w:p>
+      <w:r>
+        <w:t xml:space="preserve">Register here:</w:t>
       </w:r>
     </w:p>
     <w:p>
@@ -805,7 +1135,17 @@
     </w:p>
     <w:p>
       <w:r>
-        <w:t xml:space="preserve">Applications are live for the Digital Character Design Contest powered by AWS, Google Cloud, and IBM. The prize pool is $50,000, and winners will be awarded by Akon and Sonu Sood. Apply here:</w:t>
+        <w:t xml:space="preserve">🚀 𝗚𝗟𝗢𝗕𝗔𝗟 𝗧𝗔𝗟𝗘𝗡𝗧 𝗛𝗨𝗡𝗧 𝟮𝟬𝟮𝟲 is LIVE! 🚀</w:t>
+      </w:r>
+    </w:p>
+    <w:p>
+      <w:r>
+        <w:t xml:space="preserve">Applications are live for the Digital Character Design Contest powered by AWS, Google Cloud, and IBM. Compete for a massive 🏆 ₹𝟱𝟬 𝗟𝗔𝗞𝗛𝗦 prize pool and unlock 𝗔𝘀𝘀𝘂𝗿𝗲𝗱 𝗜𝗻𝘁𝗲𝗿𝗻𝘀𝗵𝗶𝗽𝘀 &amp; 𝗣𝗹𝗮𝗰𝗲𝗺𝗲𝗻𝘁 𝗦𝘂𝗽𝗽𝗼𝗿𝘁 for every participant! 💼✨</w:t>
+      </w:r>
+    </w:p>
+    <w:p>
+      <w:r>
+        <w:t xml:space="preserve">Apply here:</w:t>
       </w:r>
     </w:p>
     <w:p>
@@ -827,7 +1167,17 @@
     </w:p>
     <w:p>
       <w:r>
-        <w:t xml:space="preserve">The Web Experience Design Contest powered by AWS, Google Cloud, and IBM is now accepting applications. Compete for a $50,000 prize pool, with winners awarded by Akon and Sonu Sood. Enter here:</w:t>
+        <w:t xml:space="preserve">🚀 𝗚𝗟𝗢𝗕𝗔𝗟 𝗧𝗔𝗟𝗘𝗡𝗧 𝗛𝗨𝗡𝗧 𝟮𝟬𝟮𝟲 is LIVE! 🚀</w:t>
+      </w:r>
+    </w:p>
+    <w:p>
+      <w:r>
+        <w:t xml:space="preserve">The Web Experience Design Contest powered by AWS, Google Cloud, and IBM is now accepting applications. Compete for a massive 🏆 ₹𝟱𝟬 𝗟𝗔𝗞𝗛𝗦 prize pool and unlock 𝗔𝘀𝘀𝘂𝗿𝗲𝗱 𝗜𝗻𝘁𝗲𝗿𝗻𝘀𝗵𝗶𝗽𝘀 &amp; 𝗣𝗹𝗮𝗰𝗲𝗺𝗲𝗻𝘁 𝗦𝘂𝗽𝗽𝗼𝗿𝘁 for every participant! 💼✨</w:t>
+      </w:r>
+    </w:p>
+    <w:p>
+      <w:r>
+        <w:t xml:space="preserve">Enter here:</w:t>
       </w:r>
     </w:p>
     <w:p>
@@ -849,7 +1199,17 @@
     </w:p>
     <w:p>
       <w:r>
-        <w:t xml:space="preserve">Enter the AI Education Innovation Contest powered by AWS, Google Cloud, and IBM. There is a $50,000 prize pool, and winners are awarded by Akon and Sonu Sood. Secure your entry here:</w:t>
+        <w:t xml:space="preserve">🚀 𝗚𝗟𝗢𝗕𝗔𝗟 𝗧𝗔𝗟𝗘𝗡𝗧 𝗛𝗨𝗡𝗧 𝟮𝟬𝟮𝟲 is LIVE! 🚀</w:t>
+      </w:r>
+    </w:p>
+    <w:p>
+      <w:r>
+        <w:t xml:space="preserve">Enter the AI Education Innovation Contest powered by AWS, Google Cloud, and IBM. Compete for a massive 🏆 ₹𝟱𝟬 𝗟𝗔𝗞𝗛𝗦 prize pool and unlock 𝗔𝘀𝘀𝘂𝗿𝗲𝗱 𝗜𝗻𝘁𝗲𝗿𝗻𝘀𝗵𝗶𝗽𝘀 &amp; 𝗣𝗹𝗮𝗰𝗲𝗺𝗲𝗻𝘁 𝗦𝘂𝗽𝗽𝗼𝗿𝘁 for every participant! 💼✨</w:t>
+      </w:r>
+    </w:p>
+    <w:p>
+      <w:r>
+        <w:t xml:space="preserve">Secure your entry here:</w:t>
       </w:r>
     </w:p>
     <w:p>
@@ -880,7 +1240,17 @@
     </w:p>
     <w:p>
       <w:r>
-        <w:t xml:space="preserve">Secure your spot for the AI Innovation Contest powered by AWS, Google Cloud, and IBM. The $50,000 prize pool is live, and winners will be awarded by Akon and Sonu Sood. Apply here:</w:t>
+        <w:t xml:space="preserve">🚀 𝗚𝗟𝗢𝗕𝗔𝗟 𝗧𝗔𝗟𝗘𝗡𝗧 𝗛𝗨𝗡𝗧 𝟮𝟬𝟮𝟲 is LIVE! 🚀</w:t>
+      </w:r>
+    </w:p>
+    <w:p>
+      <w:r>
+        <w:t xml:space="preserve">Secure your spot for the AI Innovation Contest powered by AWS, Google Cloud, and IBM. Compete for a massive 🏆 ₹𝟱𝟬 𝗟𝗔𝗞𝗛𝗦 prize pool and unlock 𝗔𝘀𝘀𝘂𝗿𝗲𝗱 𝗜𝗻𝘁𝗲𝗿𝗻𝘀𝗵𝗶𝗽𝘀 &amp; 𝗣𝗹𝗮𝗰𝗲𝗺𝗲𝗻𝘁 𝗦𝘂𝗽𝗽𝗼𝗿𝘁 for every participant! 💼✨</w:t>
+      </w:r>
+    </w:p>
+    <w:p>
+      <w:r>
+        <w:t xml:space="preserve">Don't miss out. Apply here:</w:t>
       </w:r>
     </w:p>
     <w:p>
@@ -902,7 +1272,17 @@
     </w:p>
     <w:p>
       <w:r>
-        <w:t xml:space="preserve">The Career Accelerator Contest powered by AWS, Google Cloud, and IBM is officially open. Compete for the $50,000 prize pool and an award from Akon and Sonu Sood. Submit your application here:</w:t>
+        <w:t xml:space="preserve">🚀 𝗚𝗟𝗢𝗕𝗔𝗟 𝗧𝗔𝗟𝗘𝗡𝗧 𝗛𝗨𝗡𝗧 𝟮𝟬𝟮𝟲 is LIVE! 🚀</w:t>
+      </w:r>
+    </w:p>
+    <w:p>
+      <w:r>
+        <w:t xml:space="preserve">The Career Accelerator Contest powered by AWS, Google Cloud, and IBM is officially open. Compete for a massive 🏆 ₹𝟱𝟬 𝗟𝗔𝗞𝗛𝗦 prize pool and unlock 𝗔𝘀𝘀𝘂𝗿𝗲𝗱 𝗜𝗻𝘁𝗲𝗿𝗻𝘀𝗵𝗶𝗽𝘀 &amp; 𝗣𝗹𝗮𝗰𝗲𝗺𝗲𝗻𝘁 𝗦𝘂𝗽𝗽𝗼𝗿𝘁 for every participant! 💼✨</w:t>
+      </w:r>
+    </w:p>
+    <w:p>
+      <w:r>
+        <w:t xml:space="preserve">Submit your application here:</w:t>
       </w:r>
     </w:p>
     <w:p>
@@ -924,7 +1304,17 @@
     </w:p>
     <w:p>
       <w:r>
-        <w:t xml:space="preserve">Registration is now open for the 3D Asset Design Contest powered by AWS, Google Cloud, and IBM. There is a $50,000 prize pool on the line, with awards presented by Akon and Sonu Sood. Register here:</w:t>
+        <w:t xml:space="preserve">🚀 𝗚𝗟𝗢𝗕𝗔𝗟 𝗧𝗔𝗟𝗘𝗡𝗧 𝗛𝗨𝗡𝗧 𝟮𝟬𝟮𝟲 is LIVE! 🚀</w:t>
+      </w:r>
+    </w:p>
+    <w:p>
+      <w:r>
+        <w:t xml:space="preserve">Registration is now open for the 3D Asset Design Contest powered by AWS, Google Cloud, and IBM. Compete for a massive 🏆 ₹𝟱𝟬 𝗟𝗔𝗞𝗛𝗦 prize pool and unlock 𝗔𝘀𝘀𝘂𝗿𝗲𝗱 𝗜𝗻𝘁𝗲𝗿𝗻𝘀𝗵𝗶𝗽𝘀 &amp; 𝗣𝗹𝗮𝗰𝗲𝗺𝗲𝗻𝘁 𝗦𝘂𝗽𝗽𝗼𝗿𝘁 for every participant! 💼✨</w:t>
+      </w:r>
+    </w:p>
+    <w:p>
+      <w:r>
+        <w:t xml:space="preserve">Register here:</w:t>
       </w:r>
     </w:p>
     <w:p>
@@ -946,7 +1336,17 @@
     </w:p>
     <w:p>
       <w:r>
-        <w:t xml:space="preserve">Applications are live for the Digital Character Design Contest powered by AWS, Google Cloud, and IBM. The prize pool is $50,000, and winners will be awarded by Akon and Sonu Sood. Apply here:</w:t>
+        <w:t xml:space="preserve">🚀 𝗚𝗟𝗢𝗕𝗔𝗟 𝗧𝗔𝗟𝗘𝗡𝗧 𝗛𝗨𝗡𝗧 𝟮𝟬𝟮𝟲 is LIVE! 🚀</w:t>
+      </w:r>
+    </w:p>
+    <w:p>
+      <w:r>
+        <w:t xml:space="preserve">Applications are live for the Digital Character Design Contest powered by AWS, Google Cloud, and IBM. Compete for a massive 🏆 ₹𝟱𝟬 𝗟𝗔𝗞𝗛𝗦 prize pool and unlock 𝗔𝘀𝘀𝘂𝗿𝗲𝗱 𝗜𝗻𝘁𝗲𝗿𝗻𝘀𝗵𝗶𝗽𝘀 &amp; 𝗣𝗹𝗮𝗰𝗲𝗺𝗲𝗻𝘁 𝗦𝘂𝗽𝗽𝗼𝗿𝘁 for every participant! 💼✨</w:t>
+      </w:r>
+    </w:p>
+    <w:p>
+      <w:r>
+        <w:t xml:space="preserve">Apply here:</w:t>
       </w:r>
     </w:p>
     <w:p>
@@ -968,7 +1368,17 @@
     </w:p>
     <w:p>
       <w:r>
-        <w:t xml:space="preserve">The Web Experience Design Contest powered by AWS, Google Cloud, and IBM is now accepting applications. Compete for a $50,000 prize pool, with winners awarded by Akon and Sonu Sood. Enter here:</w:t>
+        <w:t xml:space="preserve">🚀 𝗚𝗟𝗢𝗕𝗔𝗟 𝗧𝗔𝗟𝗘𝗡𝗧 𝗛𝗨𝗡𝗧 𝟮𝟬𝟮𝟲 is LIVE! 🚀</w:t>
+      </w:r>
+    </w:p>
+    <w:p>
+      <w:r>
+        <w:t xml:space="preserve">The Web Experience Design Contest powered by AWS, Google Cloud, and IBM is now accepting applications. Compete for a massive 🏆 ₹𝟱𝟬 𝗟𝗔𝗞𝗛𝗦 prize pool and unlock 𝗔𝘀𝘀𝘂𝗿𝗲𝗱 𝗜𝗻𝘁𝗲𝗿𝗻𝘀𝗵𝗶𝗽𝘀 &amp; 𝗣𝗹𝗮𝗰𝗲𝗺𝗲𝗻𝘁 𝗦𝘂𝗽𝗽𝗼𝗿𝘁 for every participant! 💼✨</w:t>
+      </w:r>
+    </w:p>
+    <w:p>
+      <w:r>
+        <w:t xml:space="preserve">Enter here:</w:t>
       </w:r>
     </w:p>
     <w:p>
@@ -990,7 +1400,17 @@
     </w:p>
     <w:p>
       <w:r>
-        <w:t xml:space="preserve">Enter the AI Education Innovation Contest powered by AWS, Google Cloud, and IBM. There is a $50,000 prize pool, and winners are awarded by Akon and Sonu Sood. Secure your entry here:</w:t>
+        <w:t xml:space="preserve">🚀 𝗚𝗟𝗢𝗕𝗔𝗟 𝗧𝗔𝗟𝗘𝗡𝗧 𝗛𝗨𝗡𝗧 𝟮𝟬𝟮𝟲 is LIVE! 🚀</w:t>
+      </w:r>
+    </w:p>
+    <w:p>
+      <w:r>
+        <w:t xml:space="preserve">Enter the AI Education Innovation Contest powered by AWS, Google Cloud, and IBM. Compete for a massive 🏆 ₹𝟱𝟬 𝗟𝗔𝗞𝗛𝗦 prize pool and unlock 𝗔𝘀𝘀𝘂𝗿𝗲𝗱 𝗜𝗻𝘁𝗲𝗿𝗻𝘀𝗵𝗶𝗽𝘀 &amp; 𝗣𝗹𝗮𝗰𝗲𝗺𝗲𝗻𝘁 𝗦𝘂𝗽𝗽𝗼𝗿𝘁 for every participant! 💼✨</w:t>
+      </w:r>
+    </w:p>
+    <w:p>
+      <w:r>
+        <w:t xml:space="preserve">Secure your entry here:</w:t>
       </w:r>
     </w:p>
     <w:p>
@@ -1021,7 +1441,17 @@
     </w:p>
     <w:p>
       <w:r>
-        <w:t xml:space="preserve">Secure your spot for the AI Innovation Contest powered by AWS, Google Cloud, and IBM. The $50,000 prize pool is live, and winners will be awarded by Akon and Sonu Sood. Apply here:</w:t>
+        <w:t xml:space="preserve">🚀 𝗚𝗟𝗢𝗕𝗔𝗟 𝗧𝗔𝗟𝗘𝗡𝗧 𝗛𝗨𝗡𝗧 𝟮𝟬𝟮𝟲 is LIVE! 🚀</w:t>
+      </w:r>
+    </w:p>
+    <w:p>
+      <w:r>
+        <w:t xml:space="preserve">Secure your spot for the AI Innovation Contest powered by AWS, Google Cloud, and IBM. Compete for a massive 🏆 ₹𝟱𝟬 𝗟𝗔𝗞𝗛𝗦 prize pool and unlock 𝗔𝘀𝘀𝘂𝗿𝗲𝗱 𝗜𝗻𝘁𝗲𝗿𝗻𝘀𝗵𝗶𝗽𝘀 &amp; 𝗣𝗹𝗮𝗰𝗲𝗺𝗲𝗻𝘁 𝗦𝘂𝗽𝗽𝗼𝗿𝘁 for every participant! 💼✨</w:t>
+      </w:r>
+    </w:p>
+    <w:p>
+      <w:r>
+        <w:t xml:space="preserve">Don't miss out. Apply here:</w:t>
       </w:r>
     </w:p>
     <w:p>
@@ -1043,7 +1473,17 @@
     </w:p>
     <w:p>
       <w:r>
-        <w:t xml:space="preserve">The Career Accelerator Contest powered by AWS, Google Cloud, and IBM is officially open. Compete for the $50,000 prize pool and an award from Akon and Sonu Sood. Submit your application here:</w:t>
+        <w:t xml:space="preserve">🚀 𝗚𝗟𝗢𝗕𝗔𝗟 𝗧𝗔𝗟𝗘𝗡𝗧 𝗛𝗨𝗡𝗧 𝟮𝟬𝟮𝟲 is LIVE! 🚀</w:t>
+      </w:r>
+    </w:p>
+    <w:p>
+      <w:r>
+        <w:t xml:space="preserve">The Career Accelerator Contest powered by AWS, Google Cloud, and IBM is officially open. Compete for a massive 🏆 ₹𝟱𝟬 𝗟𝗔𝗞𝗛𝗦 prize pool and unlock 𝗔𝘀𝘀𝘂𝗿𝗲𝗱 𝗜𝗻𝘁𝗲𝗿𝗻𝘀𝗵𝗶𝗽𝘀 &amp; 𝗣𝗹𝗮𝗰𝗲𝗺𝗲𝗻𝘁 𝗦𝘂𝗽𝗽𝗼𝗿𝘁 for every participant! 💼✨</w:t>
+      </w:r>
+    </w:p>
+    <w:p>
+      <w:r>
+        <w:t xml:space="preserve">Submit your application here:</w:t>
       </w:r>
     </w:p>
     <w:p>
@@ -1065,7 +1505,17 @@
     </w:p>
     <w:p>
       <w:r>
-        <w:t xml:space="preserve">Registration is now open for the 3D Asset Design Contest powered by AWS, Google Cloud, and IBM. There is a $50,000 prize pool on the line, with awards presented by Akon and Sonu Sood. Register here:</w:t>
+        <w:t xml:space="preserve">🚀 𝗚𝗟𝗢𝗕𝗔𝗟 𝗧𝗔𝗟𝗘𝗡𝗧 𝗛𝗨𝗡𝗧 𝟮𝟬𝟮𝟲 is LIVE! 🚀</w:t>
+      </w:r>
+    </w:p>
+    <w:p>
+      <w:r>
+        <w:t xml:space="preserve">Registration is now open for the 3D Asset Design Contest powered by AWS, Google Cloud, and IBM. Compete for a massive 🏆 ₹𝟱𝟬 𝗟𝗔𝗞𝗛𝗦 prize pool and unlock 𝗔𝘀𝘀𝘂𝗿𝗲𝗱 𝗜𝗻𝘁𝗲𝗿𝗻𝘀𝗵𝗶𝗽𝘀 &amp; 𝗣𝗹𝗮𝗰𝗲𝗺𝗲𝗻𝘁 𝗦𝘂𝗽𝗽𝗼𝗿𝘁 for every participant! 💼✨</w:t>
+      </w:r>
+    </w:p>
+    <w:p>
+      <w:r>
+        <w:t xml:space="preserve">Register here:</w:t>
       </w:r>
     </w:p>
     <w:p>
@@ -1087,7 +1537,17 @@
     </w:p>
     <w:p>
       <w:r>
-        <w:t xml:space="preserve">Applications are live for the Digital Character Design Contest powered by AWS, Google Cloud, and IBM. The prize pool is $50,000, and winners will be awarded by Akon and Sonu Sood. Apply here:</w:t>
+        <w:t xml:space="preserve">🚀 𝗚𝗟𝗢𝗕𝗔𝗟 𝗧𝗔𝗟𝗘𝗡𝗧 𝗛𝗨𝗡𝗧 𝟮𝟬𝟮𝟲 is LIVE! 🚀</w:t>
+      </w:r>
+    </w:p>
+    <w:p>
+      <w:r>
+        <w:t xml:space="preserve">Applications are live for the Digital Character Design Contest powered by AWS, Google Cloud, and IBM. Compete for a massive 🏆 ₹𝟱𝟬 𝗟𝗔𝗞𝗛𝗦 prize pool and unlock 𝗔𝘀𝘀𝘂𝗿𝗲𝗱 𝗜𝗻𝘁𝗲𝗿𝗻𝘀𝗵𝗶𝗽𝘀 &amp; 𝗣𝗹𝗮𝗰𝗲𝗺𝗲𝗻𝘁 𝗦𝘂𝗽𝗽𝗼𝗿𝘁 for every participant! 💼✨</w:t>
+      </w:r>
+    </w:p>
+    <w:p>
+      <w:r>
+        <w:t xml:space="preserve">Apply here:</w:t>
       </w:r>
     </w:p>
     <w:p>
@@ -1109,7 +1569,17 @@
     </w:p>
     <w:p>
       <w:r>
-        <w:t xml:space="preserve">The Web Experience Design Contest powered by AWS, Google Cloud, and IBM is now accepting applications. Compete for a $50,000 prize pool, with winners awarded by Akon and Sonu Sood. Enter here:</w:t>
+        <w:t xml:space="preserve">🚀 𝗚𝗟𝗢𝗕𝗔𝗟 𝗧𝗔𝗟𝗘𝗡𝗧 𝗛𝗨𝗡𝗧 𝟮𝟬𝟮𝟲 is LIVE! 🚀</w:t>
+      </w:r>
+    </w:p>
+    <w:p>
+      <w:r>
+        <w:t xml:space="preserve">The Web Experience Design Contest powered by AWS, Google Cloud, and IBM is now accepting applications. Compete for a massive 🏆 ₹𝟱𝟬 𝗟𝗔𝗞𝗛𝗦 prize pool and unlock 𝗔𝘀𝘀𝘂𝗿𝗲𝗱 𝗜𝗻𝘁𝗲𝗿𝗻𝘀𝗵𝗶𝗽𝘀 &amp; 𝗣𝗹𝗮𝗰𝗲𝗺𝗲𝗻𝘁 𝗦𝘂𝗽𝗽𝗼𝗿𝘁 for every participant! 💼✨</w:t>
+      </w:r>
+    </w:p>
+    <w:p>
+      <w:r>
+        <w:t xml:space="preserve">Enter here:</w:t>
       </w:r>
     </w:p>
     <w:p>
@@ -1131,7 +1601,17 @@
     </w:p>
     <w:p>
       <w:r>
-        <w:t xml:space="preserve">Enter the AI Education Innovation Contest powered by AWS, Google Cloud, and IBM. There is a $50,000 prize pool, and winners are awarded by Akon and Sonu Sood. Secure your entry here:</w:t>
+        <w:t xml:space="preserve">🚀 𝗚𝗟𝗢𝗕𝗔𝗟 𝗧𝗔𝗟𝗘𝗡𝗧 𝗛𝗨𝗡𝗧 𝟮𝟬𝟮𝟲 is LIVE! 🚀</w:t>
+      </w:r>
+    </w:p>
+    <w:p>
+      <w:r>
+        <w:t xml:space="preserve">Enter the AI Education Innovation Contest powered by AWS, Google Cloud, and IBM. Compete for a massive 🏆 ₹𝟱𝟬 𝗟𝗔𝗞𝗛𝗦 prize pool and unlock 𝗔𝘀𝘀𝘂𝗿𝗲𝗱 𝗜𝗻𝘁𝗲𝗿𝗻𝘀𝗵𝗶𝗽𝘀 &amp; 𝗣𝗹𝗮𝗰𝗲𝗺𝗲𝗻𝘁 𝗦𝘂𝗽𝗽𝗼𝗿𝘁 for every participant! 💼✨</w:t>
+      </w:r>
+    </w:p>
+    <w:p>
+      <w:r>
+        <w:t xml:space="preserve">Secure your entry here:</w:t>
       </w:r>
     </w:p>
     <w:p>
@@ -1162,7 +1642,17 @@
     </w:p>
     <w:p>
       <w:r>
-        <w:t xml:space="preserve">Secure your spot for the AI Innovation Contest powered by AWS, Google Cloud, and IBM. The $50,000 prize pool is live, and winners will be awarded by Akon and Sonu Sood. Apply here:</w:t>
+        <w:t xml:space="preserve">🚀 𝗚𝗟𝗢𝗕𝗔𝗟 𝗧𝗔𝗟𝗘𝗡𝗧 𝗛𝗨𝗡𝗧 𝟮𝟬𝟮𝟲 is LIVE! 🚀</w:t>
+      </w:r>
+    </w:p>
+    <w:p>
+      <w:r>
+        <w:t xml:space="preserve">Secure your spot for the AI Innovation Contest powered by AWS, Google Cloud, and IBM. Compete for a massive 🏆 ₹𝟱𝟬 𝗟𝗔𝗞𝗛𝗦 prize pool and unlock 𝗔𝘀𝘀𝘂𝗿𝗲𝗱 𝗜𝗻𝘁𝗲𝗿𝗻𝘀𝗵𝗶𝗽𝘀 &amp; 𝗣𝗹𝗮𝗰𝗲𝗺𝗲𝗻𝘁 𝗦𝘂𝗽𝗽𝗼𝗿𝘁 for every participant! 💼✨</w:t>
+      </w:r>
+    </w:p>
+    <w:p>
+      <w:r>
+        <w:t xml:space="preserve">Don't miss out. Apply here:</w:t>
       </w:r>
     </w:p>
     <w:p>
@@ -1184,7 +1674,17 @@
     </w:p>
     <w:p>
       <w:r>
-        <w:t xml:space="preserve">The Career Accelerator Contest powered by AWS, Google Cloud, and IBM is officially open. Compete for the $50,000 prize pool and an award from Akon and Sonu Sood. Submit your application here:</w:t>
+        <w:t xml:space="preserve">🚀 𝗚𝗟𝗢𝗕𝗔𝗟 𝗧𝗔𝗟𝗘𝗡𝗧 𝗛𝗨𝗡𝗧 𝟮𝟬𝟮𝟲 is LIVE! 🚀</w:t>
+      </w:r>
+    </w:p>
+    <w:p>
+      <w:r>
+        <w:t xml:space="preserve">The Career Accelerator Contest powered by AWS, Google Cloud, and IBM is officially open. Compete for a massive 🏆 ₹𝟱𝟬 𝗟𝗔𝗞𝗛𝗦 prize pool and unlock 𝗔𝘀𝘀𝘂𝗿𝗲𝗱 𝗜𝗻𝘁𝗲𝗿𝗻𝘀𝗵𝗶𝗽𝘀 &amp; 𝗣𝗹𝗮𝗰𝗲𝗺𝗲𝗻𝘁 𝗦𝘂𝗽𝗽𝗼𝗿𝘁 for every participant! 💼✨</w:t>
+      </w:r>
+    </w:p>
+    <w:p>
+      <w:r>
+        <w:t xml:space="preserve">Submit your application here:</w:t>
       </w:r>
     </w:p>
     <w:p>
@@ -1206,7 +1706,17 @@
     </w:p>
     <w:p>
       <w:r>
-        <w:t xml:space="preserve">Registration is now open for the 3D Asset Design Contest powered by AWS, Google Cloud, and IBM. There is a $50,000 prize pool on the line, with awards presented by Akon and Sonu Sood. Register here:</w:t>
+        <w:t xml:space="preserve">🚀 𝗚𝗟𝗢𝗕𝗔𝗟 𝗧𝗔𝗟𝗘𝗡𝗧 𝗛𝗨𝗡𝗧 𝟮𝟬𝟮𝟲 is LIVE! 🚀</w:t>
+      </w:r>
+    </w:p>
+    <w:p>
+      <w:r>
+        <w:t xml:space="preserve">Registration is now open for the 3D Asset Design Contest powered by AWS, Google Cloud, and IBM. Compete for a massive 🏆 ₹𝟱𝟬 𝗟𝗔𝗞𝗛𝗦 prize pool and unlock 𝗔𝘀𝘀𝘂𝗿𝗲𝗱 𝗜𝗻𝘁𝗲𝗿𝗻𝘀𝗵𝗶𝗽𝘀 &amp; 𝗣𝗹𝗮𝗰𝗲𝗺𝗲𝗻𝘁 𝗦𝘂𝗽𝗽𝗼𝗿𝘁 for every participant! 💼✨</w:t>
+      </w:r>
+    </w:p>
+    <w:p>
+      <w:r>
+        <w:t xml:space="preserve">Register here:</w:t>
       </w:r>
     </w:p>
     <w:p>
@@ -1228,7 +1738,17 @@
     </w:p>
     <w:p>
       <w:r>
-        <w:t xml:space="preserve">Applications are live for the Digital Character Design Contest powered by AWS, Google Cloud, and IBM. The prize pool is $50,000, and winners will be awarded by Akon and Sonu Sood. Apply here:</w:t>
+        <w:t xml:space="preserve">🚀 𝗚𝗟𝗢𝗕𝗔𝗟 𝗧𝗔𝗟𝗘𝗡𝗧 𝗛𝗨𝗡𝗧 𝟮𝟬𝟮𝟲 is LIVE! 🚀</w:t>
+      </w:r>
+    </w:p>
+    <w:p>
+      <w:r>
+        <w:t xml:space="preserve">Applications are live for the Digital Character Design Contest powered by AWS, Google Cloud, and IBM. Compete for a massive 🏆 ₹𝟱𝟬 𝗟𝗔𝗞𝗛𝗦 prize pool and unlock 𝗔𝘀𝘀𝘂𝗿𝗲𝗱 𝗜𝗻𝘁𝗲𝗿𝗻𝘀𝗵𝗶𝗽𝘀 &amp; 𝗣𝗹𝗮𝗰𝗲𝗺𝗲𝗻𝘁 𝗦𝘂𝗽𝗽𝗼𝗿𝘁 for every participant! 💼✨</w:t>
+      </w:r>
+    </w:p>
+    <w:p>
+      <w:r>
+        <w:t xml:space="preserve">Apply here:</w:t>
       </w:r>
     </w:p>
     <w:p>
@@ -1250,7 +1770,17 @@
     </w:p>
     <w:p>
       <w:r>
-        <w:t xml:space="preserve">The Web Experience Design Contest powered by AWS, Google Cloud, and IBM is now accepting applications. Compete for a $50,000 prize pool, with winners awarded by Akon and Sonu Sood. Enter here:</w:t>
+        <w:t xml:space="preserve">🚀 𝗚𝗟𝗢𝗕𝗔𝗟 𝗧𝗔𝗟𝗘𝗡𝗧 𝗛𝗨𝗡𝗧 𝟮𝟬𝟮𝟲 is LIVE! 🚀</w:t>
+      </w:r>
+    </w:p>
+    <w:p>
+      <w:r>
+        <w:t xml:space="preserve">The Web Experience Design Contest powered by AWS, Google Cloud, and IBM is now accepting applications. Compete for a massive 🏆 ₹𝟱𝟬 𝗟𝗔𝗞𝗛𝗦 prize pool and unlock 𝗔𝘀𝘀𝘂𝗿𝗲𝗱 𝗜𝗻𝘁𝗲𝗿𝗻𝘀𝗵𝗶𝗽𝘀 &amp; 𝗣𝗹𝗮𝗰𝗲𝗺𝗲𝗻𝘁 𝗦𝘂𝗽𝗽𝗼𝗿𝘁 for every participant! 💼✨</w:t>
+      </w:r>
+    </w:p>
+    <w:p>
+      <w:r>
+        <w:t xml:space="preserve">Enter here:</w:t>
       </w:r>
     </w:p>
     <w:p>
@@ -1272,7 +1802,17 @@
     </w:p>
     <w:p>
       <w:r>
-        <w:t xml:space="preserve">Enter the AI Education Innovation Contest powered by AWS, Google Cloud, and IBM. There is a $50,000 prize pool, and winners are awarded by Akon and Sonu Sood. Secure your entry here:</w:t>
+        <w:t xml:space="preserve">🚀 𝗚𝗟𝗢𝗕𝗔𝗟 𝗧𝗔𝗟𝗘𝗡𝗧 𝗛𝗨𝗡𝗧 𝟮𝟬𝟮𝟲 is LIVE! 🚀</w:t>
+      </w:r>
+    </w:p>
+    <w:p>
+      <w:r>
+        <w:t xml:space="preserve">Enter the AI Education Innovation Contest powered by AWS, Google Cloud, and IBM. Compete for a massive 🏆 ₹𝟱𝟬 𝗟𝗔𝗞𝗛𝗦 prize pool and unlock 𝗔𝘀𝘀𝘂𝗿𝗲𝗱 𝗜𝗻𝘁𝗲𝗿𝗻𝘀𝗵𝗶𝗽𝘀 &amp; 𝗣𝗹𝗮𝗰𝗲𝗺𝗲𝗻𝘁 𝗦𝘂𝗽𝗽𝗼𝗿𝘁 for every participant! 💼✨</w:t>
+      </w:r>
+    </w:p>
+    <w:p>
+      <w:r>
+        <w:t xml:space="preserve">Secure your entry here:</w:t>
       </w:r>
     </w:p>
     <w:p>
@@ -1303,7 +1843,17 @@
     </w:p>
     <w:p>
       <w:r>
-        <w:t xml:space="preserve">Secure your spot for the AI Innovation Contest powered by AWS, Google Cloud, and IBM. The $50,000 prize pool is live, and winners will be awarded by Akon and Sonu Sood. Apply here:</w:t>
+        <w:t xml:space="preserve">🚀 𝗚𝗟𝗢𝗕𝗔𝗟 𝗧𝗔𝗟𝗘𝗡𝗧 𝗛𝗨𝗡𝗧 𝟮𝟬𝟮𝟲 is LIVE! 🚀</w:t>
+      </w:r>
+    </w:p>
+    <w:p>
+      <w:r>
+        <w:t xml:space="preserve">Secure your spot for the AI Innovation Contest powered by AWS, Google Cloud, and IBM. Compete for a massive 🏆 ₹𝟱𝟬 𝗟𝗔𝗞𝗛𝗦 prize pool and unlock 𝗔𝘀𝘀𝘂𝗿𝗲𝗱 𝗜𝗻𝘁𝗲𝗿𝗻𝘀𝗵𝗶𝗽𝘀 &amp; 𝗣𝗹𝗮𝗰𝗲𝗺𝗲𝗻𝘁 𝗦𝘂𝗽𝗽𝗼𝗿𝘁 for every participant! 💼✨</w:t>
+      </w:r>
+    </w:p>
+    <w:p>
+      <w:r>
+        <w:t xml:space="preserve">Don't miss out. Apply here:</w:t>
       </w:r>
     </w:p>
     <w:p>
@@ -1325,7 +1875,17 @@
     </w:p>
     <w:p>
       <w:r>
-        <w:t xml:space="preserve">The Career Accelerator Contest powered by AWS, Google Cloud, and IBM is officially open. Compete for the $50,000 prize pool and an award from Akon and Sonu Sood. Submit your application here:</w:t>
+        <w:t xml:space="preserve">🚀 𝗚𝗟𝗢𝗕𝗔𝗟 𝗧𝗔𝗟𝗘𝗡𝗧 𝗛𝗨𝗡𝗧 𝟮𝟬𝟮𝟲 is LIVE! 🚀</w:t>
+      </w:r>
+    </w:p>
+    <w:p>
+      <w:r>
+        <w:t xml:space="preserve">The Career Accelerator Contest powered by AWS, Google Cloud, and IBM is officially open. Compete for a massive 🏆 ₹𝟱𝟬 𝗟𝗔𝗞𝗛𝗦 prize pool and unlock 𝗔𝘀𝘀𝘂𝗿𝗲𝗱 𝗜𝗻𝘁𝗲𝗿𝗻𝘀𝗵𝗶𝗽𝘀 &amp; 𝗣𝗹𝗮𝗰𝗲𝗺𝗲𝗻𝘁 𝗦𝘂𝗽𝗽𝗼𝗿𝘁 for every participant! 💼✨</w:t>
+      </w:r>
+    </w:p>
+    <w:p>
+      <w:r>
+        <w:t xml:space="preserve">Submit your application here:</w:t>
       </w:r>
     </w:p>
     <w:p>
@@ -1347,7 +1907,17 @@
     </w:p>
     <w:p>
       <w:r>
-        <w:t xml:space="preserve">Registration is now open for the 3D Asset Design Contest powered by AWS, Google Cloud, and IBM. There is a $50,000 prize pool on the line, with awards presented by Akon and Sonu Sood. Register here:</w:t>
+        <w:t xml:space="preserve">🚀 𝗚𝗟𝗢𝗕𝗔𝗟 𝗧𝗔𝗟𝗘𝗡𝗧 𝗛𝗨𝗡𝗧 𝟮𝟬𝟮𝟲 is LIVE! 🚀</w:t>
+      </w:r>
+    </w:p>
+    <w:p>
+      <w:r>
+        <w:t xml:space="preserve">Registration is now open for the 3D Asset Design Contest powered by AWS, Google Cloud, and IBM. Compete for a massive 🏆 ₹𝟱𝟬 𝗟𝗔𝗞𝗛𝗦 prize pool and unlock 𝗔𝘀𝘀𝘂𝗿𝗲𝗱 𝗜𝗻𝘁𝗲𝗿𝗻𝘀𝗵𝗶𝗽𝘀 &amp; 𝗣𝗹𝗮𝗰𝗲𝗺𝗲𝗻𝘁 𝗦𝘂𝗽𝗽𝗼𝗿𝘁 for every participant! 💼✨</w:t>
+      </w:r>
+    </w:p>
+    <w:p>
+      <w:r>
+        <w:t xml:space="preserve">Register here:</w:t>
       </w:r>
     </w:p>
     <w:p>
@@ -1369,7 +1939,17 @@
     </w:p>
     <w:p>
       <w:r>
-        <w:t xml:space="preserve">Applications are live for the Digital Character Design Contest powered by AWS, Google Cloud, and IBM. The prize pool is $50,000, and winners will be awarded by Akon and Sonu Sood. Apply here:</w:t>
+        <w:t xml:space="preserve">🚀 𝗚𝗟𝗢𝗕𝗔𝗟 𝗧𝗔𝗟𝗘𝗡𝗧 𝗛𝗨𝗡𝗧 𝟮𝟬𝟮𝟲 is LIVE! 🚀</w:t>
+      </w:r>
+    </w:p>
+    <w:p>
+      <w:r>
+        <w:t xml:space="preserve">Applications are live for the Digital Character Design Contest powered by AWS, Google Cloud, and IBM. Compete for a massive 🏆 ₹𝟱𝟬 𝗟𝗔𝗞𝗛𝗦 prize pool and unlock 𝗔𝘀𝘀𝘂𝗿𝗲𝗱 𝗜𝗻𝘁𝗲𝗿𝗻𝘀𝗵𝗶𝗽𝘀 &amp; 𝗣𝗹𝗮𝗰𝗲𝗺𝗲𝗻𝘁 𝗦𝘂𝗽𝗽𝗼𝗿𝘁 for every participant! 💼✨</w:t>
+      </w:r>
+    </w:p>
+    <w:p>
+      <w:r>
+        <w:t xml:space="preserve">Apply here:</w:t>
       </w:r>
     </w:p>
     <w:p>
@@ -1391,7 +1971,17 @@
     </w:p>
     <w:p>
       <w:r>
-        <w:t xml:space="preserve">The Web Experience Design Contest powered by AWS, Google Cloud, and IBM is now accepting applications. Compete for a $50,000 prize pool, with winners awarded by Akon and Sonu Sood. Enter here:</w:t>
+        <w:t xml:space="preserve">🚀 𝗚𝗟𝗢𝗕𝗔𝗟 𝗧𝗔𝗟𝗘𝗡𝗧 𝗛𝗨𝗡𝗧 𝟮𝟬𝟮𝟲 is LIVE! 🚀</w:t>
+      </w:r>
+    </w:p>
+    <w:p>
+      <w:r>
+        <w:t xml:space="preserve">The Web Experience Design Contest powered by AWS, Google Cloud, and IBM is now accepting applications. Compete for a massive 🏆 ₹𝟱𝟬 𝗟𝗔𝗞𝗛𝗦 prize pool and unlock 𝗔𝘀𝘀𝘂𝗿𝗲𝗱 𝗜𝗻𝘁𝗲𝗿𝗻𝘀𝗵𝗶𝗽𝘀 &amp; 𝗣𝗹𝗮𝗰𝗲𝗺𝗲𝗻𝘁 𝗦𝘂𝗽𝗽𝗼𝗿𝘁 for every participant! 💼✨</w:t>
+      </w:r>
+    </w:p>
+    <w:p>
+      <w:r>
+        <w:t xml:space="preserve">Enter here:</w:t>
       </w:r>
     </w:p>
     <w:p>
@@ -1413,7 +2003,17 @@
     </w:p>
     <w:p>
       <w:r>
-        <w:t xml:space="preserve">Enter the AI Education Innovation Contest powered by AWS, Google Cloud, and IBM. There is a $50,000 prize pool, and winners are awarded by Akon and Sonu Sood. Secure your entry here:</w:t>
+        <w:t xml:space="preserve">🚀 𝗚𝗟𝗢𝗕𝗔𝗟 𝗧𝗔𝗟𝗘𝗡𝗧 𝗛𝗨𝗡𝗧 𝟮𝟬𝟮𝟲 is LIVE! 🚀</w:t>
+      </w:r>
+    </w:p>
+    <w:p>
+      <w:r>
+        <w:t xml:space="preserve">Enter the AI Education Innovation Contest powered by AWS, Google Cloud, and IBM. Compete for a massive 🏆 ₹𝟱𝟬 𝗟𝗔𝗞𝗛𝗦 prize pool and unlock 𝗔𝘀𝘀𝘂𝗿𝗲𝗱 𝗜𝗻𝘁𝗲𝗿𝗻𝘀𝗵𝗶𝗽𝘀 &amp; 𝗣𝗹𝗮𝗰𝗲𝗺𝗲𝗻𝘁 𝗦𝘂𝗽𝗽𝗼𝗿𝘁 for every participant! 💼✨</w:t>
+      </w:r>
+    </w:p>
+    <w:p>
+      <w:r>
+        <w:t xml:space="preserve">Secure your entry here:</w:t>
       </w:r>
     </w:p>
     <w:p>

</xml_diff>